<commit_message>
feat(empresas): convenio de descuentos, ventajas de la web y pagos detallados
En la página /empresas y el brochure:
- Formas de pago detalladas: efectivo, tarjeta débito/crédito, transferencia,
  Nequi y demás pagos digitales + factura electrónica.
- Sección "Un beneficio para tus empleados": convenio empresarial con 15% de
  descuento al empleado y 7.5% a su acompañante familiar, con el carnet de la
  empresa.
- Sección "Todo desde delistars.com": pedidos en línea, seguimiento en vivo,
  volver a pedir y programa de fidelización (10 domicilios = 1 premio).
- Brochure Word regenerado con las mismas secciones.

Co-Authored-By: Claude Opus 4.8 <noreply@anthropic.com>
</commit_message>
<xml_diff>
--- a/delistars-menu-magic/front/public/brochure-delistars-empresas.docx
+++ b/delistars-menu-magic/front/public/brochure-delistars-empresas.docx
@@ -1017,7 +1017,55 @@
           <w:sz w:val="22"/>
           <w:szCs w:val="22"/>
         </w:rPr>
-        <w:t xml:space="preserve">Efectivo, transferencia, Nequi y pagos digitales — como tu empresa prefiera.</w:t>
+        <w:t xml:space="preserve">Efectivo, tarjeta débito y crédito, transferencia bancaria, Nequi y demás pagos digitales.</w:t>
+      </w:r>
+    </w:p>
+    <w:p>
+      <w:pPr>
+        <w:spacing w:after="100" w:before="0" w:line="276"/>
+        <w:jc w:val="left"/>
+      </w:pPr>
+      <w:r>
+        <w:rPr>
+          <w:rFonts w:ascii="Calibri" w:cs="Calibri" w:eastAsia="Calibri" w:hAnsi="Calibri"/>
+          <w:b/>
+          <w:bCs/>
+          <w:i w:val="false"/>
+          <w:iCs w:val="false"/>
+          <w:caps w:val="false"/>
+          <w:color w:val="E88F00"/>
+          <w:sz w:val="22"/>
+          <w:szCs w:val="22"/>
+        </w:rPr>
+        <w:t xml:space="preserve">●  </w:t>
+      </w:r>
+      <w:r>
+        <w:rPr>
+          <w:rFonts w:ascii="Calibri" w:cs="Calibri" w:eastAsia="Calibri" w:hAnsi="Calibri"/>
+          <w:b/>
+          <w:bCs/>
+          <w:i w:val="false"/>
+          <w:iCs w:val="false"/>
+          <w:caps w:val="false"/>
+          <w:color w:val="262626"/>
+          <w:sz w:val="22"/>
+          <w:szCs w:val="22"/>
+        </w:rPr>
+        <w:t xml:space="preserve">Pide en delistars.com: </w:t>
+      </w:r>
+      <w:r>
+        <w:rPr>
+          <w:rFonts w:ascii="Calibri" w:cs="Calibri" w:eastAsia="Calibri" w:hAnsi="Calibri"/>
+          <w:b w:val="false"/>
+          <w:bCs w:val="false"/>
+          <w:i w:val="false"/>
+          <w:iCs w:val="false"/>
+          <w:caps w:val="false"/>
+          <w:color w:val="4A4A4A"/>
+          <w:sz w:val="22"/>
+          <w:szCs w:val="22"/>
+        </w:rPr>
+        <w:t xml:space="preserve">Menú con fotos, pedidos en línea y seguimiento del domiciliario en vivo — sin llamadas.</w:t>
       </w:r>
     </w:p>
     <w:p>
@@ -1687,6 +1735,662 @@
                 <w:szCs w:val="20"/>
               </w:rPr>
               <w:t xml:space="preserve">Aceptamos todas las formas de pago  ·  Factura electrónica  ·  Cotización a la medida</w:t>
+            </w:r>
+          </w:p>
+        </w:tc>
+      </w:tr>
+    </w:tbl>
+    <w:p>
+      <w:pPr>
+        <w:spacing w:after="200"/>
+      </w:pPr>
+      <w:r>
+        <w:rPr>
+          <w:rFonts w:ascii="Calibri" w:cs="Calibri" w:eastAsia="Calibri" w:hAnsi="Calibri"/>
+          <w:b w:val="false"/>
+          <w:bCs w:val="false"/>
+          <w:i w:val="false"/>
+          <w:iCs w:val="false"/>
+          <w:caps w:val="false"/>
+          <w:color w:val="262626"/>
+          <w:sz w:val="22"/>
+          <w:szCs w:val="22"/>
+        </w:rPr>
+        <w:t xml:space="preserve"/>
+      </w:r>
+    </w:p>
+    <w:p>
+      <w:pPr>
+        <w:spacing w:after="60" w:before="60" w:line="276"/>
+        <w:jc w:val="left"/>
+      </w:pPr>
+      <w:r>
+        <w:rPr>
+          <w:rFonts w:ascii="Calibri" w:cs="Calibri" w:eastAsia="Calibri" w:hAnsi="Calibri"/>
+          <w:b/>
+          <w:bCs/>
+          <w:i w:val="false"/>
+          <w:iCs w:val="false"/>
+          <w:caps/>
+          <w:color w:val="EA3329"/>
+          <w:spacing w:val="20"/>
+          <w:sz w:val="34"/>
+          <w:szCs w:val="34"/>
+        </w:rPr>
+        <w:t xml:space="preserve">Un beneficio para tus empleados</w:t>
+      </w:r>
+    </w:p>
+    <w:p>
+      <w:pPr>
+        <w:pBdr>
+          <w:bottom w:val="single" w:color="E88F00" w:sz="12"/>
+        </w:pBdr>
+        <w:spacing w:after="160"/>
+      </w:pPr>
+      <w:r>
+        <w:rPr>
+          <w:rFonts w:ascii="Calibri" w:cs="Calibri" w:eastAsia="Calibri" w:hAnsi="Calibri"/>
+          <w:b w:val="false"/>
+          <w:bCs w:val="false"/>
+          <w:i w:val="false"/>
+          <w:iCs w:val="false"/>
+          <w:caps w:val="false"/>
+          <w:color w:val="262626"/>
+          <w:sz w:val="22"/>
+          <w:szCs w:val="22"/>
+        </w:rPr>
+        <w:t xml:space="preserve"/>
+      </w:r>
+    </w:p>
+    <w:p>
+      <w:pPr>
+        <w:spacing w:after="140" w:before="0" w:line="276"/>
+        <w:jc w:val="left"/>
+      </w:pPr>
+      <w:r>
+        <w:rPr>
+          <w:rFonts w:ascii="Calibri" w:cs="Calibri" w:eastAsia="Calibri" w:hAnsi="Calibri"/>
+          <w:b w:val="false"/>
+          <w:bCs w:val="false"/>
+          <w:i w:val="false"/>
+          <w:iCs w:val="false"/>
+          <w:caps w:val="false"/>
+          <w:color w:val="4A4A4A"/>
+          <w:sz w:val="22"/>
+          <w:szCs w:val="22"/>
+        </w:rPr>
+        <w:t xml:space="preserve">Vincula a tu empresa con DeliStars y tu equipo obtiene descuentos permanentes presentando el </w:t>
+      </w:r>
+      <w:r>
+        <w:rPr>
+          <w:rFonts w:ascii="Calibri" w:cs="Calibri" w:eastAsia="Calibri" w:hAnsi="Calibri"/>
+          <w:b/>
+          <w:bCs/>
+          <w:i w:val="false"/>
+          <w:iCs w:val="false"/>
+          <w:caps w:val="false"/>
+          <w:color w:val="262626"/>
+          <w:sz w:val="22"/>
+          <w:szCs w:val="22"/>
+        </w:rPr>
+        <w:t xml:space="preserve">carnet de la empresa</w:t>
+      </w:r>
+      <w:r>
+        <w:rPr>
+          <w:rFonts w:ascii="Calibri" w:cs="Calibri" w:eastAsia="Calibri" w:hAnsi="Calibri"/>
+          <w:b w:val="false"/>
+          <w:bCs w:val="false"/>
+          <w:i w:val="false"/>
+          <w:iCs w:val="false"/>
+          <w:caps w:val="false"/>
+          <w:color w:val="4A4A4A"/>
+          <w:sz w:val="22"/>
+          <w:szCs w:val="22"/>
+        </w:rPr>
+        <w:t xml:space="preserve">. Un beneficio de bienestar que no te cuesta nada y tus colaboradores agradecen.</w:t>
+      </w:r>
+    </w:p>
+    <w:tbl>
+      <w:tblPr>
+        <w:tblW w:type="dxa" w:w="9360"/>
+        <w:tblBorders>
+          <w:top w:val="none" w:color="FFFFFF" w:sz="0"/>
+          <w:left w:val="none" w:color="FFFFFF" w:sz="0"/>
+          <w:bottom w:val="none" w:color="FFFFFF" w:sz="0"/>
+          <w:right w:val="none" w:color="FFFFFF" w:sz="0"/>
+          <w:insideH w:val="single" w:color="auto" w:sz="4"/>
+          <w:insideV w:val="single" w:color="auto" w:sz="4"/>
+        </w:tblBorders>
+        <w:tblLayout w:type="fixed"/>
+      </w:tblPr>
+      <w:tblGrid>
+        <w:gridCol w:w="4560"/>
+        <w:gridCol w:w="240"/>
+        <w:gridCol w:w="4560"/>
+      </w:tblGrid>
+      <w:tr>
+        <w:tc>
+          <w:tcPr>
+            <w:tcW w:type="dxa" w:w="4560"/>
+            <w:tcBorders>
+              <w:top w:val="none" w:color="FFFFFF" w:sz="0"/>
+              <w:left w:val="none" w:color="FFFFFF" w:sz="0"/>
+              <w:bottom w:val="none" w:color="FFFFFF" w:sz="0"/>
+              <w:right w:val="none" w:color="FFFFFF" w:sz="0"/>
+            </w:tcBorders>
+            <w:shd w:fill="189386" w:color="auto" w:val="clear"/>
+            <w:tcMar>
+              <w:top w:type="dxa" w:w="180"/>
+              <w:left w:type="dxa" w:w="200"/>
+              <w:bottom w:type="dxa" w:w="180"/>
+              <w:right w:type="dxa" w:w="200"/>
+            </w:tcMar>
+            <w:vAlign w:val="center"/>
+          </w:tcPr>
+          <w:p>
+            <w:pPr>
+              <w:spacing w:after="20" w:before="0" w:line="240"/>
+              <w:jc w:val="center"/>
+            </w:pPr>
+            <w:r>
+              <w:rPr>
+                <w:rFonts w:ascii="Calibri" w:cs="Calibri" w:eastAsia="Calibri" w:hAnsi="Calibri"/>
+                <w:b/>
+                <w:bCs/>
+                <w:i w:val="false"/>
+                <w:iCs w:val="false"/>
+                <w:caps w:val="false"/>
+                <w:color w:val="FFFFFF"/>
+                <w:sz w:val="56"/>
+                <w:szCs w:val="56"/>
+              </w:rPr>
+              <w:t xml:space="preserve">15%</w:t>
+            </w:r>
+          </w:p>
+          <w:p>
+            <w:pPr>
+              <w:spacing w:after="0" w:before="0" w:line="220"/>
+              <w:jc w:val="center"/>
+            </w:pPr>
+            <w:r>
+              <w:rPr>
+                <w:rFonts w:ascii="Calibri" w:cs="Calibri" w:eastAsia="Calibri" w:hAnsi="Calibri"/>
+                <w:b/>
+                <w:bCs/>
+                <w:i w:val="false"/>
+                <w:iCs w:val="false"/>
+                <w:caps w:val="false"/>
+                <w:color w:val="FFFFFF"/>
+                <w:sz w:val="18"/>
+                <w:szCs w:val="18"/>
+              </w:rPr>
+              <w:t xml:space="preserve">de descuento para el empleado</w:t>
+            </w:r>
+          </w:p>
+        </w:tc>
+        <w:tc>
+          <w:tcPr>
+            <w:tcW w:type="dxa" w:w="240"/>
+            <w:tcBorders>
+              <w:top w:val="none" w:color="FFFFFF" w:sz="0"/>
+              <w:left w:val="none" w:color="FFFFFF" w:sz="0"/>
+              <w:bottom w:val="none" w:color="FFFFFF" w:sz="0"/>
+              <w:right w:val="none" w:color="FFFFFF" w:sz="0"/>
+            </w:tcBorders>
+          </w:tcPr>
+          <w:p>
+            <w:pPr>
+              <w:spacing w:after="0" w:before="0" w:line="276"/>
+              <w:jc w:val="left"/>
+            </w:pPr>
+            <w:r>
+              <w:rPr>
+                <w:rFonts w:ascii="Calibri" w:cs="Calibri" w:eastAsia="Calibri" w:hAnsi="Calibri"/>
+                <w:b w:val="false"/>
+                <w:bCs w:val="false"/>
+                <w:i w:val="false"/>
+                <w:iCs w:val="false"/>
+                <w:caps w:val="false"/>
+                <w:color w:val="262626"/>
+                <w:sz w:val="22"/>
+                <w:szCs w:val="22"/>
+              </w:rPr>
+              <w:t xml:space="preserve"/>
+            </w:r>
+          </w:p>
+        </w:tc>
+        <w:tc>
+          <w:tcPr>
+            <w:tcW w:type="dxa" w:w="4560"/>
+            <w:tcBorders>
+              <w:top w:val="none" w:color="FFFFFF" w:sz="0"/>
+              <w:left w:val="none" w:color="FFFFFF" w:sz="0"/>
+              <w:bottom w:val="none" w:color="FFFFFF" w:sz="0"/>
+              <w:right w:val="none" w:color="FFFFFF" w:sz="0"/>
+            </w:tcBorders>
+            <w:shd w:fill="E88F00" w:color="auto" w:val="clear"/>
+            <w:tcMar>
+              <w:top w:type="dxa" w:w="180"/>
+              <w:left w:type="dxa" w:w="200"/>
+              <w:bottom w:type="dxa" w:w="180"/>
+              <w:right w:type="dxa" w:w="200"/>
+            </w:tcMar>
+            <w:vAlign w:val="center"/>
+          </w:tcPr>
+          <w:p>
+            <w:pPr>
+              <w:spacing w:after="20" w:before="0" w:line="240"/>
+              <w:jc w:val="center"/>
+            </w:pPr>
+            <w:r>
+              <w:rPr>
+                <w:rFonts w:ascii="Calibri" w:cs="Calibri" w:eastAsia="Calibri" w:hAnsi="Calibri"/>
+                <w:b/>
+                <w:bCs/>
+                <w:i w:val="false"/>
+                <w:iCs w:val="false"/>
+                <w:caps w:val="false"/>
+                <w:color w:val="FFFFFF"/>
+                <w:sz w:val="56"/>
+                <w:szCs w:val="56"/>
+              </w:rPr>
+              <w:t xml:space="preserve">7.5%</w:t>
+            </w:r>
+          </w:p>
+          <w:p>
+            <w:pPr>
+              <w:spacing w:after="0" w:before="0" w:line="220"/>
+              <w:jc w:val="center"/>
+            </w:pPr>
+            <w:r>
+              <w:rPr>
+                <w:rFonts w:ascii="Calibri" w:cs="Calibri" w:eastAsia="Calibri" w:hAnsi="Calibri"/>
+                <w:b/>
+                <w:bCs/>
+                <w:i w:val="false"/>
+                <w:iCs w:val="false"/>
+                <w:caps w:val="false"/>
+                <w:color w:val="FFFFFF"/>
+                <w:sz w:val="18"/>
+                <w:szCs w:val="18"/>
+              </w:rPr>
+              <w:t xml:space="preserve">para su acompañante familiar</w:t>
+            </w:r>
+          </w:p>
+        </w:tc>
+      </w:tr>
+    </w:tbl>
+    <w:p>
+      <w:pPr>
+        <w:spacing w:after="80"/>
+      </w:pPr>
+      <w:r>
+        <w:rPr>
+          <w:rFonts w:ascii="Calibri" w:cs="Calibri" w:eastAsia="Calibri" w:hAnsi="Calibri"/>
+          <w:b w:val="false"/>
+          <w:bCs w:val="false"/>
+          <w:i w:val="false"/>
+          <w:iCs w:val="false"/>
+          <w:caps w:val="false"/>
+          <w:color w:val="262626"/>
+          <w:sz w:val="22"/>
+          <w:szCs w:val="22"/>
+        </w:rPr>
+        <w:t xml:space="preserve"/>
+      </w:r>
+    </w:p>
+    <w:p>
+      <w:pPr>
+        <w:spacing w:after="0" w:before="0" w:line="276"/>
+        <w:jc w:val="left"/>
+      </w:pPr>
+      <w:r>
+        <w:rPr>
+          <w:rFonts w:ascii="Calibri" w:cs="Calibri" w:eastAsia="Calibri" w:hAnsi="Calibri"/>
+          <w:b w:val="false"/>
+          <w:bCs w:val="false"/>
+          <w:i/>
+          <w:iCs/>
+          <w:caps w:val="false"/>
+          <w:color w:val="4A4A4A"/>
+          <w:sz w:val="16"/>
+          <w:szCs w:val="16"/>
+        </w:rPr>
+        <w:t xml:space="preserve">* Presentando el carnet de la empresa vinculada, para el empleado y un acompañante familiar en el momento de la compra.</w:t>
+      </w:r>
+    </w:p>
+    <w:p>
+      <w:r>
+        <w:br w:type="page"/>
+      </w:r>
+    </w:p>
+    <w:p>
+      <w:pPr>
+        <w:spacing w:after="60" w:before="60" w:line="276"/>
+        <w:jc w:val="left"/>
+      </w:pPr>
+      <w:r>
+        <w:rPr>
+          <w:rFonts w:ascii="Calibri" w:cs="Calibri" w:eastAsia="Calibri" w:hAnsi="Calibri"/>
+          <w:b/>
+          <w:bCs/>
+          <w:i w:val="false"/>
+          <w:iCs w:val="false"/>
+          <w:caps/>
+          <w:color w:val="EA3329"/>
+          <w:spacing w:val="20"/>
+          <w:sz w:val="34"/>
+          <w:szCs w:val="34"/>
+        </w:rPr>
+        <w:t xml:space="preserve">Todo desde delistars.com</w:t>
+      </w:r>
+    </w:p>
+    <w:p>
+      <w:pPr>
+        <w:pBdr>
+          <w:bottom w:val="single" w:color="E88F00" w:sz="12"/>
+        </w:pBdr>
+        <w:spacing w:after="160"/>
+      </w:pPr>
+      <w:r>
+        <w:rPr>
+          <w:rFonts w:ascii="Calibri" w:cs="Calibri" w:eastAsia="Calibri" w:hAnsi="Calibri"/>
+          <w:b w:val="false"/>
+          <w:bCs w:val="false"/>
+          <w:i w:val="false"/>
+          <w:iCs w:val="false"/>
+          <w:caps w:val="false"/>
+          <w:color w:val="262626"/>
+          <w:sz w:val="22"/>
+          <w:szCs w:val="22"/>
+        </w:rPr>
+        <w:t xml:space="preserve"/>
+      </w:r>
+    </w:p>
+    <w:p>
+      <w:pPr>
+        <w:spacing w:after="120" w:before="0" w:line="276"/>
+        <w:jc w:val="left"/>
+      </w:pPr>
+      <w:r>
+        <w:rPr>
+          <w:rFonts w:ascii="Calibri" w:cs="Calibri" w:eastAsia="Calibri" w:hAnsi="Calibri"/>
+          <w:b w:val="false"/>
+          <w:bCs w:val="false"/>
+          <w:i w:val="false"/>
+          <w:iCs w:val="false"/>
+          <w:caps w:val="false"/>
+          <w:color w:val="4A4A4A"/>
+          <w:sz w:val="22"/>
+          <w:szCs w:val="22"/>
+        </w:rPr>
+        <w:t xml:space="preserve">Nuestra plataforma propia hace que pedir para tu empresa sea rápido y transparente:</w:t>
+      </w:r>
+    </w:p>
+    <w:p>
+      <w:pPr>
+        <w:spacing w:after="100" w:before="0" w:line="276"/>
+        <w:jc w:val="left"/>
+      </w:pPr>
+      <w:r>
+        <w:rPr>
+          <w:rFonts w:ascii="Calibri" w:cs="Calibri" w:eastAsia="Calibri" w:hAnsi="Calibri"/>
+          <w:b/>
+          <w:bCs/>
+          <w:i w:val="false"/>
+          <w:iCs w:val="false"/>
+          <w:caps w:val="false"/>
+          <w:color w:val="189386"/>
+          <w:sz w:val="22"/>
+          <w:szCs w:val="22"/>
+        </w:rPr>
+        <w:t xml:space="preserve">●  </w:t>
+      </w:r>
+      <w:r>
+        <w:rPr>
+          <w:rFonts w:ascii="Calibri" w:cs="Calibri" w:eastAsia="Calibri" w:hAnsi="Calibri"/>
+          <w:b/>
+          <w:bCs/>
+          <w:i w:val="false"/>
+          <w:iCs w:val="false"/>
+          <w:caps w:val="false"/>
+          <w:color w:val="262626"/>
+          <w:sz w:val="22"/>
+          <w:szCs w:val="22"/>
+        </w:rPr>
+        <w:t xml:space="preserve">Pide en línea: </w:t>
+      </w:r>
+      <w:r>
+        <w:rPr>
+          <w:rFonts w:ascii="Calibri" w:cs="Calibri" w:eastAsia="Calibri" w:hAnsi="Calibri"/>
+          <w:b w:val="false"/>
+          <w:bCs w:val="false"/>
+          <w:i w:val="false"/>
+          <w:iCs w:val="false"/>
+          <w:caps w:val="false"/>
+          <w:color w:val="4A4A4A"/>
+          <w:sz w:val="22"/>
+          <w:szCs w:val="22"/>
+        </w:rPr>
+        <w:t xml:space="preserve">Menú completo con fotos y precios — sin llamadas ni esperas.</w:t>
+      </w:r>
+    </w:p>
+    <w:p>
+      <w:pPr>
+        <w:spacing w:after="100" w:before="0" w:line="276"/>
+        <w:jc w:val="left"/>
+      </w:pPr>
+      <w:r>
+        <w:rPr>
+          <w:rFonts w:ascii="Calibri" w:cs="Calibri" w:eastAsia="Calibri" w:hAnsi="Calibri"/>
+          <w:b/>
+          <w:bCs/>
+          <w:i w:val="false"/>
+          <w:iCs w:val="false"/>
+          <w:caps w:val="false"/>
+          <w:color w:val="189386"/>
+          <w:sz w:val="22"/>
+          <w:szCs w:val="22"/>
+        </w:rPr>
+        <w:t xml:space="preserve">●  </w:t>
+      </w:r>
+      <w:r>
+        <w:rPr>
+          <w:rFonts w:ascii="Calibri" w:cs="Calibri" w:eastAsia="Calibri" w:hAnsi="Calibri"/>
+          <w:b/>
+          <w:bCs/>
+          <w:i w:val="false"/>
+          <w:iCs w:val="false"/>
+          <w:caps w:val="false"/>
+          <w:color w:val="262626"/>
+          <w:sz w:val="22"/>
+          <w:szCs w:val="22"/>
+        </w:rPr>
+        <w:t xml:space="preserve">Seguimiento en vivo: </w:t>
+      </w:r>
+      <w:r>
+        <w:rPr>
+          <w:rFonts w:ascii="Calibri" w:cs="Calibri" w:eastAsia="Calibri" w:hAnsi="Calibri"/>
+          <w:b w:val="false"/>
+          <w:bCs w:val="false"/>
+          <w:i w:val="false"/>
+          <w:iCs w:val="false"/>
+          <w:caps w:val="false"/>
+          <w:color w:val="4A4A4A"/>
+          <w:sz w:val="22"/>
+          <w:szCs w:val="22"/>
+        </w:rPr>
+        <w:t xml:space="preserve">Tu equipo ve el estado del pedido y la ubicación del domiciliario en tiempo real.</w:t>
+      </w:r>
+    </w:p>
+    <w:p>
+      <w:pPr>
+        <w:spacing w:after="100" w:before="0" w:line="276"/>
+        <w:jc w:val="left"/>
+      </w:pPr>
+      <w:r>
+        <w:rPr>
+          <w:rFonts w:ascii="Calibri" w:cs="Calibri" w:eastAsia="Calibri" w:hAnsi="Calibri"/>
+          <w:b/>
+          <w:bCs/>
+          <w:i w:val="false"/>
+          <w:iCs w:val="false"/>
+          <w:caps w:val="false"/>
+          <w:color w:val="189386"/>
+          <w:sz w:val="22"/>
+          <w:szCs w:val="22"/>
+        </w:rPr>
+        <w:t xml:space="preserve">●  </w:t>
+      </w:r>
+      <w:r>
+        <w:rPr>
+          <w:rFonts w:ascii="Calibri" w:cs="Calibri" w:eastAsia="Calibri" w:hAnsi="Calibri"/>
+          <w:b/>
+          <w:bCs/>
+          <w:i w:val="false"/>
+          <w:iCs w:val="false"/>
+          <w:caps w:val="false"/>
+          <w:color w:val="262626"/>
+          <w:sz w:val="22"/>
+          <w:szCs w:val="22"/>
+        </w:rPr>
+        <w:t xml:space="preserve">Volver a pedir: </w:t>
+      </w:r>
+      <w:r>
+        <w:rPr>
+          <w:rFonts w:ascii="Calibri" w:cs="Calibri" w:eastAsia="Calibri" w:hAnsi="Calibri"/>
+          <w:b w:val="false"/>
+          <w:bCs w:val="false"/>
+          <w:i w:val="false"/>
+          <w:iCs w:val="false"/>
+          <w:caps w:val="false"/>
+          <w:color w:val="4A4A4A"/>
+          <w:sz w:val="22"/>
+          <w:szCs w:val="22"/>
+        </w:rPr>
+        <w:t xml:space="preserve">Historial y repetición del pedido con un toque, ideal para pedidos frecuentes.</w:t>
+      </w:r>
+    </w:p>
+    <w:p>
+      <w:pPr>
+        <w:spacing w:after="100" w:before="0" w:line="276"/>
+        <w:jc w:val="left"/>
+      </w:pPr>
+      <w:r>
+        <w:rPr>
+          <w:rFonts w:ascii="Calibri" w:cs="Calibri" w:eastAsia="Calibri" w:hAnsi="Calibri"/>
+          <w:b/>
+          <w:bCs/>
+          <w:i w:val="false"/>
+          <w:iCs w:val="false"/>
+          <w:caps w:val="false"/>
+          <w:color w:val="189386"/>
+          <w:sz w:val="22"/>
+          <w:szCs w:val="22"/>
+        </w:rPr>
+        <w:t xml:space="preserve">●  </w:t>
+      </w:r>
+      <w:r>
+        <w:rPr>
+          <w:rFonts w:ascii="Calibri" w:cs="Calibri" w:eastAsia="Calibri" w:hAnsi="Calibri"/>
+          <w:b/>
+          <w:bCs/>
+          <w:i w:val="false"/>
+          <w:iCs w:val="false"/>
+          <w:caps w:val="false"/>
+          <w:color w:val="262626"/>
+          <w:sz w:val="22"/>
+          <w:szCs w:val="22"/>
+        </w:rPr>
+        <w:t xml:space="preserve">Programa de fidelización: </w:t>
+      </w:r>
+      <w:r>
+        <w:rPr>
+          <w:rFonts w:ascii="Calibri" w:cs="Calibri" w:eastAsia="Calibri" w:hAnsi="Calibri"/>
+          <w:b w:val="false"/>
+          <w:bCs w:val="false"/>
+          <w:i w:val="false"/>
+          <w:iCs w:val="false"/>
+          <w:caps w:val="false"/>
+          <w:color w:val="4A4A4A"/>
+          <w:sz w:val="22"/>
+          <w:szCs w:val="22"/>
+        </w:rPr>
+        <w:t xml:space="preserve">Cada 10 domicilios entregados, una Hamburguesa Especial gratis.</w:t>
+      </w:r>
+    </w:p>
+    <w:p>
+      <w:pPr>
+        <w:spacing w:after="120"/>
+      </w:pPr>
+      <w:r>
+        <w:rPr>
+          <w:rFonts w:ascii="Calibri" w:cs="Calibri" w:eastAsia="Calibri" w:hAnsi="Calibri"/>
+          <w:b w:val="false"/>
+          <w:bCs w:val="false"/>
+          <w:i w:val="false"/>
+          <w:iCs w:val="false"/>
+          <w:caps w:val="false"/>
+          <w:color w:val="262626"/>
+          <w:sz w:val="22"/>
+          <w:szCs w:val="22"/>
+        </w:rPr>
+        <w:t xml:space="preserve"/>
+      </w:r>
+    </w:p>
+    <w:tbl>
+      <w:tblPr>
+        <w:tblW w:type="dxa" w:w="9360"/>
+        <w:tblBorders>
+          <w:top w:val="none" w:color="FFFFFF" w:sz="0"/>
+          <w:left w:val="none" w:color="FFFFFF" w:sz="0"/>
+          <w:bottom w:val="none" w:color="FFFFFF" w:sz="0"/>
+          <w:right w:val="none" w:color="FFFFFF" w:sz="0"/>
+          <w:insideH w:val="single" w:color="auto" w:sz="4"/>
+          <w:insideV w:val="single" w:color="auto" w:sz="4"/>
+        </w:tblBorders>
+        <w:tblLayout w:type="fixed"/>
+      </w:tblPr>
+      <w:tblGrid>
+        <w:gridCol w:w="9360"/>
+      </w:tblGrid>
+      <w:tr>
+        <w:tc>
+          <w:tcPr>
+            <w:tcW w:type="dxa" w:w="9360"/>
+            <w:tcBorders>
+              <w:top w:val="none" w:color="FFFFFF" w:sz="0"/>
+              <w:left w:val="none" w:color="FFFFFF" w:sz="0"/>
+              <w:bottom w:val="none" w:color="FFFFFF" w:sz="0"/>
+              <w:right w:val="none" w:color="FFFFFF" w:sz="0"/>
+            </w:tcBorders>
+            <w:shd w:fill="F5E9D6" w:color="auto" w:val="clear"/>
+            <w:tcMar>
+              <w:top w:type="dxa" w:w="130"/>
+              <w:left w:type="dxa" w:w="220"/>
+              <w:bottom w:type="dxa" w:w="130"/>
+              <w:right w:type="dxa" w:w="220"/>
+            </w:tcMar>
+            <w:vAlign w:val="center"/>
+          </w:tcPr>
+          <w:p>
+            <w:pPr>
+              <w:spacing w:after="0" w:before="0" w:line="276"/>
+              <w:jc w:val="center"/>
+            </w:pPr>
+            <w:r>
+              <w:rPr>
+                <w:rFonts w:ascii="Calibri" w:cs="Calibri" w:eastAsia="Calibri" w:hAnsi="Calibri"/>
+                <w:b/>
+                <w:bCs/>
+                <w:i/>
+                <w:iCs/>
+                <w:caps w:val="false"/>
+                <w:color w:val="262626"/>
+                <w:sz w:val="20"/>
+                <w:szCs w:val="20"/>
+              </w:rPr>
+              <w:t xml:space="preserve">www.delistars.com  ·  Pide, sigue y repite en un solo lugar</w:t>
             </w:r>
           </w:p>
         </w:tc>

</xml_diff>

<commit_message>
feat(empresas): bono de regalo corporativo digital + descarte de dos propuestas
Punto 7 (soluciones sugeridas), decisión del cliente:
- Se descartan "facturación mensual consolidada" y "precio cerrado por
  persona" (se quita esa frase del paquete "A tu medida").
- Se desarrolla el "bono de regalo corporativo digital": sección propia y
  destacada (no una tarjetita más) explicando qué es, cómo lo recibe el
  empleado (código digital por WhatsApp/correo, sin tarjetas físicas) y por
  qué le sirve a la empresa (una sola compra, factura electrónica). Refuerza
  que cada empleado canjea lo que quiera, sin coordinar un pedido grupal.
- Mismo contenido replicado en el brochure (Word + PDF).

Co-Authored-By: Claude Opus 4.8 <noreply@anthropic.com>
</commit_message>
<xml_diff>
--- a/delistars-menu-magic/front/public/brochure-delistars-empresas.docx
+++ b/delistars-menu-magic/front/public/brochure-delistars-empresas.docx
@@ -2274,6 +2274,447 @@
         <w:t xml:space="preserve"/>
       </w:r>
     </w:p>
+    <w:tbl>
+      <w:tblPr>
+        <w:tblW w:type="dxa" w:w="9360"/>
+        <w:tblBorders>
+          <w:top w:val="none" w:color="FFFFFF" w:sz="0"/>
+          <w:left w:val="none" w:color="FFFFFF" w:sz="0"/>
+          <w:bottom w:val="none" w:color="FFFFFF" w:sz="0"/>
+          <w:right w:val="none" w:color="FFFFFF" w:sz="0"/>
+          <w:insideH w:val="single" w:color="auto" w:sz="4"/>
+          <w:insideV w:val="single" w:color="auto" w:sz="4"/>
+        </w:tblBorders>
+        <w:tblLayout w:type="fixed"/>
+      </w:tblPr>
+      <w:tblGrid>
+        <w:gridCol w:w="9360"/>
+      </w:tblGrid>
+      <w:tr>
+        <w:tc>
+          <w:tcPr>
+            <w:tcW w:type="dxa" w:w="9360"/>
+            <w:tcBorders>
+              <w:top w:val="none" w:color="FFFFFF" w:sz="0"/>
+              <w:left w:val="none" w:color="FFFFFF" w:sz="0"/>
+              <w:bottom w:val="none" w:color="FFFFFF" w:sz="0"/>
+              <w:right w:val="none" w:color="FFFFFF" w:sz="0"/>
+            </w:tcBorders>
+            <w:shd w:fill="E88F00" w:color="auto" w:val="clear"/>
+            <w:tcMar>
+              <w:top w:type="dxa" w:w="220"/>
+              <w:left w:type="dxa" w:w="220"/>
+              <w:bottom w:type="dxa" w:w="220"/>
+              <w:right w:type="dxa" w:w="220"/>
+            </w:tcMar>
+            <w:vAlign w:val="center"/>
+          </w:tcPr>
+          <w:p>
+            <w:pPr>
+              <w:spacing w:after="80" w:before="0" w:line="276"/>
+              <w:jc w:val="center"/>
+            </w:pPr>
+            <w:r>
+              <w:rPr>
+                <w:rFonts w:ascii="Calibri" w:cs="Calibri" w:eastAsia="Calibri" w:hAnsi="Calibri"/>
+                <w:b/>
+                <w:bCs/>
+                <w:i w:val="false"/>
+                <w:iCs w:val="false"/>
+                <w:caps w:val="false"/>
+                <w:color w:val="FFFFFF"/>
+                <w:spacing w:val="10"/>
+                <w:sz w:val="16"/>
+                <w:szCs w:val="16"/>
+              </w:rPr>
+              <w:t xml:space="preserve">🎟️  NUEVO · PARA PREMIAR EMPLEADOS</w:t>
+            </w:r>
+          </w:p>
+          <w:p>
+            <w:pPr>
+              <w:spacing w:after="120" w:before="0" w:line="280"/>
+              <w:jc w:val="center"/>
+            </w:pPr>
+            <w:r>
+              <w:rPr>
+                <w:rFonts w:ascii="Calibri" w:cs="Calibri" w:eastAsia="Calibri" w:hAnsi="Calibri"/>
+                <w:b/>
+                <w:bCs/>
+                <w:i w:val="false"/>
+                <w:iCs w:val="false"/>
+                <w:caps w:val="false"/>
+                <w:color w:val="FFFFFF"/>
+                <w:sz w:val="30"/>
+                <w:szCs w:val="30"/>
+              </w:rPr>
+              <w:t xml:space="preserve">Bonos de regalo corporativos digitales</w:t>
+            </w:r>
+          </w:p>
+          <w:p>
+            <w:pPr>
+              <w:spacing w:after="160" w:before="0" w:line="280"/>
+              <w:jc w:val="center"/>
+            </w:pPr>
+            <w:r>
+              <w:rPr>
+                <w:rFonts w:ascii="Calibri" w:cs="Calibri" w:eastAsia="Calibri" w:hAnsi="Calibri"/>
+                <w:b w:val="false"/>
+                <w:bCs w:val="false"/>
+                <w:i w:val="false"/>
+                <w:iCs w:val="false"/>
+                <w:caps w:val="false"/>
+                <w:color w:val="FFFFFF"/>
+                <w:sz w:val="20"/>
+                <w:szCs w:val="20"/>
+              </w:rPr>
+              <w:t xml:space="preserve">Tu empresa compra bonos DeliStars por el valor que decidas y se los entrega a tus empleados como reconocimiento — un código digital que cada quien canjea cuando quiera, pidiendo lo que más se le antoje del menú. Nada de coordinar un pedido grupal ni adivinar gustos: cada empleado elige el suyo.</w:t>
+            </w:r>
+          </w:p>
+        </w:tc>
+      </w:tr>
+    </w:tbl>
+    <w:p>
+      <w:pPr>
+        <w:spacing w:after="140"/>
+      </w:pPr>
+      <w:r>
+        <w:rPr>
+          <w:rFonts w:ascii="Calibri" w:cs="Calibri" w:eastAsia="Calibri" w:hAnsi="Calibri"/>
+          <w:b w:val="false"/>
+          <w:bCs w:val="false"/>
+          <w:i w:val="false"/>
+          <w:iCs w:val="false"/>
+          <w:caps w:val="false"/>
+          <w:color w:val="262626"/>
+          <w:sz w:val="22"/>
+          <w:szCs w:val="22"/>
+        </w:rPr>
+        <w:t xml:space="preserve"/>
+      </w:r>
+    </w:p>
+    <w:tbl>
+      <w:tblPr>
+        <w:tblW w:type="dxa" w:w="9360"/>
+        <w:tblBorders>
+          <w:top w:val="none" w:color="FFFFFF" w:sz="0"/>
+          <w:left w:val="none" w:color="FFFFFF" w:sz="0"/>
+          <w:bottom w:val="none" w:color="FFFFFF" w:sz="0"/>
+          <w:right w:val="none" w:color="FFFFFF" w:sz="0"/>
+          <w:insideH w:val="single" w:color="auto" w:sz="4"/>
+          <w:insideV w:val="single" w:color="auto" w:sz="4"/>
+        </w:tblBorders>
+        <w:tblLayout w:type="fixed"/>
+      </w:tblPr>
+      <w:tblGrid>
+        <w:gridCol w:w="3120"/>
+        <w:gridCol w:w="60"/>
+        <w:gridCol w:w="3120"/>
+        <w:gridCol w:w="60"/>
+        <w:gridCol w:w="3120"/>
+      </w:tblGrid>
+      <w:tr>
+        <w:tc>
+          <w:tcPr>
+            <w:tcW w:type="dxa" w:w="3120"/>
+            <w:tcBorders>
+              <w:top w:val="none" w:color="FFFFFF" w:sz="0"/>
+              <w:left w:val="none" w:color="FFFFFF" w:sz="0"/>
+              <w:bottom w:val="none" w:color="FFFFFF" w:sz="0"/>
+              <w:right w:val="none" w:color="FFFFFF" w:sz="0"/>
+            </w:tcBorders>
+            <w:shd w:fill="F5E9D6" w:color="auto" w:val="clear"/>
+            <w:tcMar>
+              <w:top w:type="dxa" w:w="150"/>
+              <w:left w:type="dxa" w:w="150"/>
+              <w:bottom w:type="dxa" w:w="150"/>
+              <w:right w:type="dxa" w:w="150"/>
+            </w:tcMar>
+            <w:vAlign w:val="top"/>
+          </w:tcPr>
+          <w:p>
+            <w:pPr>
+              <w:spacing w:after="60" w:before="0" w:line="276"/>
+              <w:jc w:val="left"/>
+            </w:pPr>
+            <w:r>
+              <w:rPr>
+                <w:rFonts w:ascii="Calibri" w:cs="Calibri" w:eastAsia="Calibri" w:hAnsi="Calibri"/>
+                <w:b w:val="false"/>
+                <w:bCs w:val="false"/>
+                <w:i w:val="false"/>
+                <w:iCs w:val="false"/>
+                <w:caps w:val="false"/>
+                <w:color w:val="262626"/>
+                <w:sz w:val="22"/>
+                <w:szCs w:val="22"/>
+              </w:rPr>
+              <w:t xml:space="preserve">🎯  </w:t>
+            </w:r>
+            <w:r>
+              <w:rPr>
+                <w:rFonts w:ascii="Calibri" w:cs="Calibri" w:eastAsia="Calibri" w:hAnsi="Calibri"/>
+                <w:b/>
+                <w:bCs/>
+                <w:i w:val="false"/>
+                <w:iCs w:val="false"/>
+                <w:caps w:val="false"/>
+                <w:color w:val="262626"/>
+                <w:sz w:val="19"/>
+                <w:szCs w:val="19"/>
+              </w:rPr>
+              <w:t xml:space="preserve">Ideal para</w:t>
+            </w:r>
+          </w:p>
+          <w:p>
+            <w:pPr>
+              <w:spacing w:after="0" w:before="0" w:line="240"/>
+              <w:jc w:val="left"/>
+            </w:pPr>
+            <w:r>
+              <w:rPr>
+                <w:rFonts w:ascii="Calibri" w:cs="Calibri" w:eastAsia="Calibri" w:hAnsi="Calibri"/>
+                <w:b w:val="false"/>
+                <w:bCs w:val="false"/>
+                <w:i w:val="false"/>
+                <w:iCs w:val="false"/>
+                <w:caps w:val="false"/>
+                <w:color w:val="4A4A4A"/>
+                <w:sz w:val="18"/>
+                <w:szCs w:val="18"/>
+              </w:rPr>
+              <w:t xml:space="preserve">Reconocimientos, cumpleaños individuales, cierre de año, incentivos de desempeño.</w:t>
+            </w:r>
+          </w:p>
+        </w:tc>
+        <w:tc>
+          <w:tcPr>
+            <w:tcW w:type="dxa" w:w="60"/>
+            <w:tcBorders>
+              <w:top w:val="none" w:color="FFFFFF" w:sz="0"/>
+              <w:left w:val="none" w:color="FFFFFF" w:sz="0"/>
+              <w:bottom w:val="none" w:color="FFFFFF" w:sz="0"/>
+              <w:right w:val="none" w:color="FFFFFF" w:sz="0"/>
+            </w:tcBorders>
+          </w:tcPr>
+          <w:p>
+            <w:pPr>
+              <w:spacing w:after="0" w:before="0" w:line="276"/>
+              <w:jc w:val="left"/>
+            </w:pPr>
+            <w:r>
+              <w:rPr>
+                <w:rFonts w:ascii="Calibri" w:cs="Calibri" w:eastAsia="Calibri" w:hAnsi="Calibri"/>
+                <w:b w:val="false"/>
+                <w:bCs w:val="false"/>
+                <w:i w:val="false"/>
+                <w:iCs w:val="false"/>
+                <w:caps w:val="false"/>
+                <w:color w:val="262626"/>
+                <w:sz w:val="22"/>
+                <w:szCs w:val="22"/>
+              </w:rPr>
+              <w:t xml:space="preserve"/>
+            </w:r>
+          </w:p>
+        </w:tc>
+        <w:tc>
+          <w:tcPr>
+            <w:tcW w:type="dxa" w:w="3120"/>
+            <w:tcBorders>
+              <w:top w:val="none" w:color="FFFFFF" w:sz="0"/>
+              <w:left w:val="none" w:color="FFFFFF" w:sz="0"/>
+              <w:bottom w:val="none" w:color="FFFFFF" w:sz="0"/>
+              <w:right w:val="none" w:color="FFFFFF" w:sz="0"/>
+            </w:tcBorders>
+            <w:shd w:fill="F5E9D6" w:color="auto" w:val="clear"/>
+            <w:tcMar>
+              <w:top w:type="dxa" w:w="150"/>
+              <w:left w:type="dxa" w:w="150"/>
+              <w:bottom w:type="dxa" w:w="150"/>
+              <w:right w:type="dxa" w:w="150"/>
+            </w:tcMar>
+            <w:vAlign w:val="top"/>
+          </w:tcPr>
+          <w:p>
+            <w:pPr>
+              <w:spacing w:after="60" w:before="0" w:line="276"/>
+              <w:jc w:val="left"/>
+            </w:pPr>
+            <w:r>
+              <w:rPr>
+                <w:rFonts w:ascii="Calibri" w:cs="Calibri" w:eastAsia="Calibri" w:hAnsi="Calibri"/>
+                <w:b w:val="false"/>
+                <w:bCs w:val="false"/>
+                <w:i w:val="false"/>
+                <w:iCs w:val="false"/>
+                <w:caps w:val="false"/>
+                <w:color w:val="262626"/>
+                <w:sz w:val="22"/>
+                <w:szCs w:val="22"/>
+              </w:rPr>
+              <w:t xml:space="preserve">📱  </w:t>
+            </w:r>
+            <w:r>
+              <w:rPr>
+                <w:rFonts w:ascii="Calibri" w:cs="Calibri" w:eastAsia="Calibri" w:hAnsi="Calibri"/>
+                <w:b/>
+                <w:bCs/>
+                <w:i w:val="false"/>
+                <w:iCs w:val="false"/>
+                <w:caps w:val="false"/>
+                <w:color w:val="262626"/>
+                <w:sz w:val="19"/>
+                <w:szCs w:val="19"/>
+              </w:rPr>
+              <w:t xml:space="preserve">Cómo llega</w:t>
+            </w:r>
+          </w:p>
+          <w:p>
+            <w:pPr>
+              <w:spacing w:after="0" w:before="0" w:line="240"/>
+              <w:jc w:val="left"/>
+            </w:pPr>
+            <w:r>
+              <w:rPr>
+                <w:rFonts w:ascii="Calibri" w:cs="Calibri" w:eastAsia="Calibri" w:hAnsi="Calibri"/>
+                <w:b w:val="false"/>
+                <w:bCs w:val="false"/>
+                <w:i w:val="false"/>
+                <w:iCs w:val="false"/>
+                <w:caps w:val="false"/>
+                <w:color w:val="4A4A4A"/>
+                <w:sz w:val="18"/>
+                <w:szCs w:val="18"/>
+              </w:rPr>
+              <w:t xml:space="preserve">Un código digital por WhatsApp o correo — sin tarjetas físicas que imprimir ni repartir.</w:t>
+            </w:r>
+          </w:p>
+        </w:tc>
+        <w:tc>
+          <w:tcPr>
+            <w:tcW w:type="dxa" w:w="60"/>
+            <w:tcBorders>
+              <w:top w:val="none" w:color="FFFFFF" w:sz="0"/>
+              <w:left w:val="none" w:color="FFFFFF" w:sz="0"/>
+              <w:bottom w:val="none" w:color="FFFFFF" w:sz="0"/>
+              <w:right w:val="none" w:color="FFFFFF" w:sz="0"/>
+            </w:tcBorders>
+          </w:tcPr>
+          <w:p>
+            <w:pPr>
+              <w:spacing w:after="0" w:before="0" w:line="276"/>
+              <w:jc w:val="left"/>
+            </w:pPr>
+            <w:r>
+              <w:rPr>
+                <w:rFonts w:ascii="Calibri" w:cs="Calibri" w:eastAsia="Calibri" w:hAnsi="Calibri"/>
+                <w:b w:val="false"/>
+                <w:bCs w:val="false"/>
+                <w:i w:val="false"/>
+                <w:iCs w:val="false"/>
+                <w:caps w:val="false"/>
+                <w:color w:val="262626"/>
+                <w:sz w:val="22"/>
+                <w:szCs w:val="22"/>
+              </w:rPr>
+              <w:t xml:space="preserve"/>
+            </w:r>
+          </w:p>
+        </w:tc>
+        <w:tc>
+          <w:tcPr>
+            <w:tcW w:type="dxa" w:w="3120"/>
+            <w:tcBorders>
+              <w:top w:val="none" w:color="FFFFFF" w:sz="0"/>
+              <w:left w:val="none" w:color="FFFFFF" w:sz="0"/>
+              <w:bottom w:val="none" w:color="FFFFFF" w:sz="0"/>
+              <w:right w:val="none" w:color="FFFFFF" w:sz="0"/>
+            </w:tcBorders>
+            <w:shd w:fill="F5E9D6" w:color="auto" w:val="clear"/>
+            <w:tcMar>
+              <w:top w:type="dxa" w:w="150"/>
+              <w:left w:type="dxa" w:w="150"/>
+              <w:bottom w:type="dxa" w:w="150"/>
+              <w:right w:type="dxa" w:w="150"/>
+            </w:tcMar>
+            <w:vAlign w:val="top"/>
+          </w:tcPr>
+          <w:p>
+            <w:pPr>
+              <w:spacing w:after="60" w:before="0" w:line="276"/>
+              <w:jc w:val="left"/>
+            </w:pPr>
+            <w:r>
+              <w:rPr>
+                <w:rFonts w:ascii="Calibri" w:cs="Calibri" w:eastAsia="Calibri" w:hAnsi="Calibri"/>
+                <w:b w:val="false"/>
+                <w:bCs w:val="false"/>
+                <w:i w:val="false"/>
+                <w:iCs w:val="false"/>
+                <w:caps w:val="false"/>
+                <w:color w:val="262626"/>
+                <w:sz w:val="22"/>
+                <w:szCs w:val="22"/>
+              </w:rPr>
+              <w:t xml:space="preserve">🧾  </w:t>
+            </w:r>
+            <w:r>
+              <w:rPr>
+                <w:rFonts w:ascii="Calibri" w:cs="Calibri" w:eastAsia="Calibri" w:hAnsi="Calibri"/>
+                <w:b/>
+                <w:bCs/>
+                <w:i w:val="false"/>
+                <w:iCs w:val="false"/>
+                <w:caps w:val="false"/>
+                <w:color w:val="262626"/>
+                <w:sz w:val="19"/>
+                <w:szCs w:val="19"/>
+              </w:rPr>
+              <w:t xml:space="preserve">Para la empresa</w:t>
+            </w:r>
+          </w:p>
+          <w:p>
+            <w:pPr>
+              <w:spacing w:after="0" w:before="0" w:line="240"/>
+              <w:jc w:val="left"/>
+            </w:pPr>
+            <w:r>
+              <w:rPr>
+                <w:rFonts w:ascii="Calibri" w:cs="Calibri" w:eastAsia="Calibri" w:hAnsi="Calibri"/>
+                <w:b w:val="false"/>
+                <w:bCs w:val="false"/>
+                <w:i w:val="false"/>
+                <w:iCs w:val="false"/>
+                <w:caps w:val="false"/>
+                <w:color w:val="4A4A4A"/>
+                <w:sz w:val="18"/>
+                <w:szCs w:val="18"/>
+              </w:rPr>
+              <w:t xml:space="preserve">Una sola compra por el valor y la cantidad que necesites, con factura electrónica.</w:t>
+            </w:r>
+          </w:p>
+        </w:tc>
+      </w:tr>
+    </w:tbl>
+    <w:p>
+      <w:pPr>
+        <w:spacing w:after="200"/>
+      </w:pPr>
+      <w:r>
+        <w:rPr>
+          <w:rFonts w:ascii="Calibri" w:cs="Calibri" w:eastAsia="Calibri" w:hAnsi="Calibri"/>
+          <w:b w:val="false"/>
+          <w:bCs w:val="false"/>
+          <w:i w:val="false"/>
+          <w:iCs w:val="false"/>
+          <w:caps w:val="false"/>
+          <w:color w:val="262626"/>
+          <w:sz w:val="22"/>
+          <w:szCs w:val="22"/>
+        </w:rPr>
+        <w:t xml:space="preserve"/>
+      </w:r>
+    </w:p>
     <w:p>
       <w:pPr>
         <w:spacing w:after="60" w:before="60" w:line="276"/>
@@ -2548,7 +2989,7 @@
           <w:sz w:val="22"/>
           <w:szCs w:val="22"/>
         </w:rPr>
-        <w:t xml:space="preserve">Armamos el menú contigo, con precio cerrado por persona. </w:t>
+        <w:t xml:space="preserve">Armamos el menú contigo según lo que necesites para tu evento. </w:t>
       </w:r>
       <w:r>
         <w:rPr>
@@ -2562,7 +3003,7 @@
           <w:sz w:val="20"/>
           <w:szCs w:val="20"/>
         </w:rPr>
-        <w:t xml:space="preserve">Ideal para Eventos con presupuesto definido.</w:t>
+        <w:t xml:space="preserve">Ideal para Eventos con requerimientos particulares.</w:t>
       </w:r>
     </w:p>
     <w:p>

</xml_diff>

<commit_message>
fix(empresas): brochure — "Área Metro" completo a "Área Metropolitana"
Coherente con el mismo ajuste en la página web.

Co-Authored-By: Claude Opus 4.8 <noreply@anthropic.com>
</commit_message>
<xml_diff>
--- a/delistars-menu-magic/front/public/brochure-delistars-empresas.docx
+++ b/delistars-menu-magic/front/public/brochure-delistars-empresas.docx
@@ -677,10 +677,10 @@
                 <w:iCs w:val="false"/>
                 <w:caps w:val="false"/>
                 <w:color w:val="FFFFFF"/>
-                <w:sz w:val="30"/>
-                <w:szCs w:val="30"/>
-              </w:rPr>
-              <w:t xml:space="preserve">Área Metro</w:t>
+                <w:sz w:val="18"/>
+                <w:szCs w:val="18"/>
+              </w:rPr>
+              <w:t xml:space="preserve">Área Metropolitana</w:t>
             </w:r>
           </w:p>
           <w:p>

</xml_diff>

<commit_message>
fix(empresas): salsas y cebollas de la ficha segun la base de datos
Las salsas de la ficha estaban escritas a mano y no coincidian con lo que
el cliente puede escoger de verdad. La categoria 8 tiene 11 salsas, todas
ya en $0: se agregaron Roja, Mayonesa, Mostaza y Queso, que faltaban.

Las cebollas quedan en cruda y sofrita, que son las unicas que existen en
la base (categoria 5 con precio 0, que es de donde las lee el menu).
Caramelizada se sigue nombrando en el texto de "Sabor que se recuerda"
pero no es seleccionable: queda pendiente decidir si se agrega a la base
o se quita del texto.

Nota: el precio de $3.500 del guacamole que se habia visto estaba en la
lista ADDONS de src/data/menu.ts, que es codigo muerto — nadie la
importa. En produccion las salsas nunca se cobraron.

Co-Authored-By: Claude Opus 5 <noreply@anthropic.com>
</commit_message>
<xml_diff>
--- a/delistars-menu-magic/front/public/brochure-delistars-empresas.docx
+++ b/delistars-menu-magic/front/public/brochure-delistars-empresas.docx
@@ -9872,7 +9872,7 @@
           <w:color w:val="4A4A4A"/>
           <w:sz w:val="22"/>
         </w:rPr>
-        <w:t>Guacamole de la casa, Mayochipotle, BBQ, Piña, Tártara, Ajo, Rosada.</w:t>
+        <w:t>Guacamole, Mayochipotle, BBQ, Piña, Tártara, Ajo, Rosada, Roja, Mayonesa, Mostaza, Queso.</w:t>
       </w:r>
     </w:p>
     <w:p>
@@ -9892,7 +9892,7 @@
           <w:color w:val="4A4A4A"/>
           <w:sz w:val="22"/>
         </w:rPr>
-        <w:t>cruda, sofrita, caramelizada.</w:t>
+        <w:t>cruda, sofrita.</w:t>
       </w:r>
     </w:p>
     <w:p>

</xml_diff>